<commit_message>
next steps on appendix
</commit_message>
<xml_diff>
--- a/_tables/tbl-prim-cares-mmrm-time-since-baseline.docx
+++ b/_tables/tbl-prim-cares-mmrm-time-since-baseline.docx
@@ -109,7 +109,7 @@
                 <w:rFonts w:ascii="Calibri" w:hAnsi="Calibri"/>
                 <w:sz w:val="20"/>
               </w:rPr>
-              <w:t xml:space="preserve">p-value</w:t>
+              <w:t xml:space="preserve">p</w:t>
             </w:r>
           </w:p>
         </w:tc>
@@ -1458,7 +1458,7 @@
                 <w:rFonts w:ascii="Calibri" w:hAnsi="Calibri"/>
                 <w:sz w:val="20"/>
               </w:rPr>
-              <w:t xml:space="default">    Module 1 (post) * Intervention</w:t>
+              <w:t xml:space="default">    Module 1 * Intervention</w:t>
             </w:r>
           </w:p>
         </w:tc>
@@ -1559,7 +1559,7 @@
                 <w:rFonts w:ascii="Calibri" w:hAnsi="Calibri"/>
                 <w:sz w:val="20"/>
               </w:rPr>
-              <w:t xml:space="default">    Module 2 (post) * Intervention</w:t>
+              <w:t xml:space="default">    Module 2 * Intervention</w:t>
             </w:r>
           </w:p>
         </w:tc>
@@ -1660,7 +1660,7 @@
                 <w:rFonts w:ascii="Calibri" w:hAnsi="Calibri"/>
                 <w:sz w:val="20"/>
               </w:rPr>
-              <w:t xml:space="default">    Module 3 (post) * Intervention</w:t>
+              <w:t xml:space="default">    Module 3 * Intervention</w:t>
             </w:r>
           </w:p>
         </w:tc>
@@ -1761,7 +1761,7 @@
                 <w:rFonts w:ascii="Calibri" w:hAnsi="Calibri"/>
                 <w:sz w:val="20"/>
               </w:rPr>
-              <w:t xml:space="default">    Module 4 (post) * Intervention</w:t>
+              <w:t xml:space="default">    Module 4 * Intervention</w:t>
             </w:r>
           </w:p>
         </w:tc>
@@ -1862,7 +1862,7 @@
                 <w:rFonts w:ascii="Calibri" w:hAnsi="Calibri"/>
                 <w:sz w:val="20"/>
               </w:rPr>
-              <w:t xml:space="default">    Module 5 (post) * Intervention</w:t>
+              <w:t xml:space="default">    Module 5 * Intervention</w:t>
             </w:r>
           </w:p>
         </w:tc>
@@ -1963,7 +1963,7 @@
                 <w:rFonts w:ascii="Calibri" w:hAnsi="Calibri"/>
                 <w:sz w:val="20"/>
               </w:rPr>
-              <w:t xml:space="default">    Module 6 (post) * Intervention</w:t>
+              <w:t xml:space="default">    Module 6 * Intervention</w:t>
             </w:r>
           </w:p>
         </w:tc>
@@ -2166,7 +2166,7 @@
                 <w:rFonts w:ascii="Calibri" w:hAnsi="Calibri"/>
                 <w:sz w:val="20"/>
               </w:rPr>
-              <w:t xml:space="default">    Module 1 (post)</w:t>
+              <w:t xml:space="default">    Module 1</w:t>
             </w:r>
           </w:p>
         </w:tc>
@@ -2267,7 +2267,7 @@
                 <w:rFonts w:ascii="Calibri" w:hAnsi="Calibri"/>
                 <w:sz w:val="20"/>
               </w:rPr>
-              <w:t xml:space="default">    Module 2 (post)</w:t>
+              <w:t xml:space="default">    Module 2</w:t>
             </w:r>
           </w:p>
         </w:tc>
@@ -2368,7 +2368,7 @@
                 <w:rFonts w:ascii="Calibri" w:hAnsi="Calibri"/>
                 <w:sz w:val="20"/>
               </w:rPr>
-              <w:t xml:space="default">    Module 3 (post)</w:t>
+              <w:t xml:space="default">    Module 3</w:t>
             </w:r>
           </w:p>
         </w:tc>
@@ -2469,7 +2469,7 @@
                 <w:rFonts w:ascii="Calibri" w:hAnsi="Calibri"/>
                 <w:sz w:val="20"/>
               </w:rPr>
-              <w:t xml:space="default">    Module 4 (post)</w:t>
+              <w:t xml:space="default">    Module 4</w:t>
             </w:r>
           </w:p>
         </w:tc>
@@ -2570,7 +2570,7 @@
                 <w:rFonts w:ascii="Calibri" w:hAnsi="Calibri"/>
                 <w:sz w:val="20"/>
               </w:rPr>
-              <w:t xml:space="default">    Module 5 (post)</w:t>
+              <w:t xml:space="default">    Module 5</w:t>
             </w:r>
           </w:p>
         </w:tc>
@@ -2671,7 +2671,7 @@
                 <w:rFonts w:ascii="Calibri" w:hAnsi="Calibri"/>
                 <w:sz w:val="20"/>
               </w:rPr>
-              <w:t xml:space="default">    Module 6 (post)</w:t>
+              <w:t xml:space="default">    Module 6</w:t>
             </w:r>
           </w:p>
         </w:tc>

</xml_diff>